<commit_message>
Update the teachers' paper-formatting guide (Word and PDF)
Co-Authored-By: Claude Opus 5.5 <noreply@anthropic.com>
</commit_message>
<xml_diff>
--- a/docs/paper_formatting_guide.docx
+++ b/docs/paper_formatting_guide.docx
@@ -546,6 +546,7 @@
           <w:sz w:val="19"/>
           <w:szCs w:val="19"/>
         </w:rPr>
+        <w:lastRenderedPageBreak/>
         <w:t xml:space="preserve">Never skip a number or repeat one – keep </w:t>
       </w:r>
       <w:proofErr w:type="gramStart"/>
@@ -1225,6 +1226,7 @@
                 <w:sz w:val="19"/>
                 <w:szCs w:val="19"/>
               </w:rPr>
+              <w:lastRenderedPageBreak/>
               <w:t>1. (3)</w:t>
             </w:r>
           </w:p>
@@ -1455,6 +1457,45 @@
           <w:szCs w:val="21"/>
         </w:rPr>
         <w:t>Don't skip or repeat a question number.</w:t>
+      </w:r>
+    </w:p>
+    <w:p>
+      <w:pPr>
+        <w:pStyle w:val="ListParagraph"/>
+        <w:numPr>
+          <w:ilvl w:val="0"/>
+          <w:numId w:val="2"/>
+        </w:numPr>
+        <w:spacing w:after="100"/>
+      </w:pPr>
+      <w:r>
+        <w:t>Sinhala: "Iskoola Pota" (built into Windows already) or "Noto Sans Sinhala"</w:t>
+      </w:r>
+    </w:p>
+    <w:p>
+      <w:pPr>
+        <w:pStyle w:val="ListParagraph"/>
+        <w:numPr>
+          <w:ilvl w:val="0"/>
+          <w:numId w:val="2"/>
+        </w:numPr>
+        <w:spacing w:after="100"/>
+      </w:pPr>
+      <w:r>
+        <w:t>Tamil: "Latha" (built into Windows already) or "Noto Sans Tamil"</w:t>
+      </w:r>
+    </w:p>
+    <w:p>
+      <w:pPr>
+        <w:pStyle w:val="ListParagraph"/>
+        <w:numPr>
+          <w:ilvl w:val="0"/>
+          <w:numId w:val="2"/>
+        </w:numPr>
+        <w:spacing w:after="100"/>
+      </w:pPr>
+      <w:r>
+        <w:t>English: Any font</w:t>
       </w:r>
     </w:p>
     <w:p>

</xml_diff>